<commit_message>
Hesap kural kartlarını güncelle: KDVK 21/ç ve antrepo teminat alanı
- K6: ÖTV (I) sayılı listede teminata esas ÖTV, 24.07.2025'ten itibaren
  KDVK md. 21/ç uyarınca KDV matrahına girer; 2025/15 anahtarı (ç)
  öncesi kurala dayanır.
- Antrepo götürü teminatı: "açık + kapalı alan" yalnız resmî anahtarlara
  dayanıyor, GY md. 527 metninde yok; yeni soruda esas alan kökte
  doğrudan verilir, saha alanı tuzak veri yapılmaz.

Co-Authored-By: Claude Opus 5.5 <noreply@anthropic.com>
Claude-Session: https://claude.ai/code/session_01GgDEz86kKogUAFjPuHAFPg
</commit_message>
<xml_diff>
--- a/00-SORU-YAZARI-ANALIZI-VE-PROMPTLAR/06-SORU-PROMPTU-4_HESAPLAMA.docx
+++ b/00-SORU-YAZARI-ANALIZI-VE-PROMPTLAR/06-SORU-PROMPTU-4_HESAPLAMA.docx
@@ -1819,7 +1819,23 @@
         <w:t xml:space="preserve"> </w:t>
       </w:r>
       <w:r>
-        <w:t xml:space="preserve">İthalatta gümrükte ÖTV tahsil edilmez; teminat alınır. Litre başı vergi verilse bile kullanılmaz (tuzak veri; 2025/15).</w:t>
+        <w:t xml:space="preserve">İthalatta gümrükte ÖTV tahsil edilmez; teminat alınır (ÖTVK md. 16/4). Litre başı vergi tahsil edilecek tutara katılmaz (2025/15).</w:t>
+      </w:r>
+      <w:r>
+        <w:t xml:space="preserve"> </w:t>
+      </w:r>
+      <w:r>
+        <w:rPr>
+          <w:bCs/>
+          <w:b/>
+        </w:rPr>
+        <w:t xml:space="preserve">Ancak 24.07.2025’ten itibaren KDVK md. 21/ç uyarınca teminata esas ÖTV ithalde KDV matrahına girer;</w:t>
+      </w:r>
+      <w:r>
+        <w:t xml:space="preserve"> </w:t>
+      </w:r>
+      <w:r>
+        <w:t xml:space="preserve">bu tarihten sonra tescil edilen beyannamede litre başı vergi KDV matrahı için kullanılır. 2025/15 anahtarı (ç) bendi öncesi kurala dayanır; yeni soruda tescil tarihini kökte ver.</w:t>
       </w:r>
     </w:p>
     <w:p>
@@ -2199,7 +2215,7 @@
         <w:t xml:space="preserve"> </w:t>
       </w:r>
       <w:r>
-        <w:t xml:space="preserve">Açık + kapalı alanın toplamı esas alınır, içinde bulunulan saha alanı esas alınmaz. Tank antrepoda toplam tank hacmi (m³) esas alınır. Kademeler ve</w:t>
+        <w:t xml:space="preserve">Resmî anahtarlar (2022/41, 2024/83-A) açık + kapalı alanın toplamını esas aldı, içinde bulunulan saha alanını almadı; GY md. 527 metninde bu ayrım açıkça yazmaz. Yeni soruda antreponun hesaba esas alanını kökte doğrudan ver, saha alanını tuzak veri yapma. Tank antrepoda toplam tank hacmi (m³) esas alınır. Kademeler ve</w:t>
       </w:r>
       <w:r>
         <w:t xml:space="preserve"> </w:t>
@@ -2696,7 +2712,7 @@
         <w:t xml:space="preserve"> </w:t>
       </w:r>
       <w:r>
-        <w:t xml:space="preserve">Her vakada en az bir kullanılmaması gereken bilgi bulunur: ödeme tarihi kuru, saha alanı, litre başı ÖTV, önceki yıl indirimi, temettü, zamanaşımına uğramış yıl.</w:t>
+        <w:t xml:space="preserve">Her vakada en az bir kullanılmaması gereken bilgi bulunur: ödeme tarihi kuru, litre başı ÖTV (yalnız tahsil edilecek tutarda; KDV matrahında 21/ç bkz. K6), önceki yıl indirimi, temettü, zamanaşımına uğramış yıl.</w:t>
       </w:r>
     </w:p>
     <w:p>

</xml_diff>

<commit_message>
Kıymet kural kartı: önceki işlem indirimi kuralını resmî anahtara bağla
"Önceki işlemlerden kazanılmış özel indirim fiyattan düşülmez" kuralı
GK md. 24-28 ve GY md. 43-57 metninde açıkça yazmıyor; yalnız 2023/79
resmî anahtarına dayanıyor. Kartta bu belirtildi ve tuzak veri
listesinden çıkarıldı; yeni soruda kural kökte açıkça verilmeli.

Co-Authored-By: Claude Opus 5.5 <noreply@anthropic.com>
Claude-Session: https://claude.ai/code/session_01GgDEz86kKogUAFjPuHAFPg
</commit_message>
<xml_diff>
--- a/00-SORU-YAZARI-ANALIZI-VE-PROMPTLAR/06-SORU-PROMPTU-4_HESAPLAMA.docx
+++ b/00-SORU-YAZARI-ANALIZI-VE-PROMPTLAR/06-SORU-PROMPTU-4_HESAPLAMA.docx
@@ -1381,7 +1381,7 @@
         <w:pStyle w:val="Compact"/>
       </w:pPr>
       <w:r>
-        <w:t xml:space="preserve">Önceki işlemlerden kazanılmış özel indirim (bu eşyanın fiyatından düşülmez; 2023/79).</w:t>
+        <w:t xml:space="preserve">Önceki işlemlerden kazanılmış özel indirim (2023/79 resmî anahtarı bu eşyanın fiyatından düşmedi; GK md. 24–28 ve GY md. 43–57 metninde açık hüküm yok — yeni soruda bu kalemi kullanma ya da kuralı kökte açıkça ver).</w:t>
       </w:r>
     </w:p>
     <w:p>
@@ -2712,7 +2712,7 @@
         <w:t xml:space="preserve"> </w:t>
       </w:r>
       <w:r>
-        <w:t xml:space="preserve">Her vakada en az bir kullanılmaması gereken bilgi bulunur: ödeme tarihi kuru, litre başı ÖTV (yalnız tahsil edilecek tutarda; KDV matrahında 21/ç bkz. K6), önceki yıl indirimi, temettü, zamanaşımına uğramış yıl.</w:t>
+        <w:t xml:space="preserve">Her vakada en az bir kullanılmaması gereken bilgi bulunur: ödeme tarihi kuru, litre başı ÖTV (yalnız tahsil edilecek tutarda; KDV matrahında 21/ç bkz. K6), temettü, zamanaşımına uğramış yıl.</w:t>
       </w:r>
     </w:p>
     <w:p>

</xml_diff>